<commit_message>
Introduction: format, proof read
</commit_message>
<xml_diff>
--- a/proposal/output/paper.docx
+++ b/proposal/output/paper.docx
@@ -16,7 +16,7 @@
         <w:pStyle w:val="FirstParagraph"/>
       </w:pPr>
       <w:r>
-        <w:t xml:space="preserve">Како је људски говор у великој мери мери обликован емоцијама, које утичу на тон гласа, паузе у говору, контекст разговора као и на невербалне сигнале као што је израз лица, од посебног је значаја аутоматски препознати људске емоције код система који комуницирају са људима. Управо због комплексности људских емоција и начина изражавања, аутоматско препознавање емоција је изузетно интересантна и изазовна област савремене вештачке интелигенције.</w:t>
+        <w:t xml:space="preserve">Како је људски говор у великој мери обликован емоцијама, које утичу на тон гласа, паузе у говору и контекст разговора, као и на невербалне сигнале попут израза лица, од посебног је значаја да системи који комуницирају са људима буду у стању да аутоматски препознају људске емоције. Управо због комплексности људских емоција и начина њиховог изражавања, аутоматско препознавање емоција представља изузетно интересантну и изазовну област савремене вештачке интелигенције.</w:t>
       </w:r>
     </w:p>
     <w:p>
@@ -24,7 +24,7 @@
         <w:pStyle w:val="BodyText"/>
       </w:pPr>
       <w:r>
-        <w:t xml:space="preserve">У наредним поглављима ћемо прво размотрити област аутоматског препознавања емоција, шта је њен циљ, методе и технике које се користе у оквиру области као и различите примере примена препознавања емоција. С обзиром да су од техника најбоље показале неуронске мреже, у следећем поглављу ћемо обрадити принцип рада неуронских мрежа и како се оне тренирају, а затим и комплексније архитектуре као што су рекурентне мреже, трансформери и граф неуронске мреже. На крају ове области ћемо такође објаснити квантизацију, као основну технику оптимизације перформанси неуронских мрежа. Циљ ове области је објаснити основе неопходне за разумевање</w:t>
+        <w:t xml:space="preserve">У наредним поглављима ћемо прво размотрити област аутоматског препознавања емоција, њен циљ, методе и технике које се у њој користе, као и различите примере примене. С обзиром на то да су се од свих техника најбоље показале неуронске мреже, у следећем поглављу ћемо обрадити принцип рада неуронских мрежа и начин на који се оне тренирају, а затим и сложеније архитектуре, као што су рекурентне мреже, трансформери и граф неуронске мреже. На крају тог поглавља ћемо објаснити и квантизацију, као једну од основних техника оптимизације перформанси неуронских мрежа. Циљ овог поглавља је да објасни основе неопходне за разумевање модела</w:t>
       </w:r>
       <w:r>
         <w:t xml:space="preserve"> </w:t>
@@ -37,7 +37,10 @@
         <w:t xml:space="preserve">COGMEN</w:t>
       </w:r>
       <w:r>
-        <w:t xml:space="preserve">-а - граф неуронске мреже која ће послужити као основни модел који ћемо касније трансформисати. Последња област је о архитектури</w:t>
+        <w:t xml:space="preserve"> </w:t>
+      </w:r>
+      <w:r>
+        <w:t xml:space="preserve">– граф неуронске мреже која ће послужити као основни модел који ћемо касније модификовати. Након детаљне анализе модела</w:t>
       </w:r>
       <w:r>
         <w:t xml:space="preserve"> </w:t>
@@ -47,36 +50,36 @@
           <w:i/>
           <w:iCs/>
         </w:rPr>
-        <w:t xml:space="preserve">JEPA</w:t>
-      </w:r>
-      <w:r>
-        <w:t xml:space="preserve"> </w:t>
-      </w:r>
-      <w:r>
-        <w:t xml:space="preserve">(</w:t>
+        <w:t xml:space="preserve">COGMEN</w:t>
+      </w:r>
+      <w:r>
+        <w:t xml:space="preserve">, обрадићемо архитектуру</w:t>
+      </w:r>
+      <w:r>
+        <w:t xml:space="preserve"> </w:t>
       </w:r>
       <w:r>
         <w:rPr>
           <w:i/>
           <w:iCs/>
         </w:rPr>
-        <w:t xml:space="preserve">Joint Embedding Predictive Architecture</w:t>
-      </w:r>
-      <w:r>
-        <w:t xml:space="preserve">), коју ћемо користити у имплентацији како би тренирали модел да предвиђа квалитетније латентне репрезентације мултимодалних</w:t>
-      </w:r>
-      <w:r>
-        <w:t xml:space="preserve"> </w:t>
+        <w:t xml:space="preserve">JEPA</w:t>
+      </w:r>
+      <w:r>
+        <w:t xml:space="preserve"> </w:t>
+      </w:r>
+      <w:r>
+        <w:t xml:space="preserve">(</w:t>
       </w:r>
       <w:r>
         <w:rPr>
           <w:i/>
           <w:iCs/>
         </w:rPr>
-        <w:t xml:space="preserve">embedding</w:t>
-      </w:r>
-      <w:r>
-        <w:t xml:space="preserve">-а са улаза</w:t>
+        <w:t xml:space="preserve">Joint Embedding Predictive Architecture</w:t>
+      </w:r>
+      <w:r>
+        <w:t xml:space="preserve">), коју ћемо користити у имплементацији како бисмо модел научили да предвиђа квалитетније латентне репрезентације мултимодалних</w:t>
       </w:r>
       <w:r>
         <w:t xml:space="preserve"> </w:t>
@@ -86,13 +89,10 @@
           <w:i/>
           <w:iCs/>
         </w:rPr>
-        <w:t xml:space="preserve">COGMEN</w:t>
-      </w:r>
-      <w:r>
-        <w:t xml:space="preserve"> </w:t>
-      </w:r>
-      <w:r>
-        <w:t xml:space="preserve">модела. Овом архитектуром ћемо такође покушати да реконструишемо маскиране модале као и будуће репрезентације на основу тренутних. На овај начин модификован</w:t>
+        <w:t xml:space="preserve">embedding</w:t>
+      </w:r>
+      <w:r>
+        <w:t xml:space="preserve">-а са улаза модела</w:t>
       </w:r>
       <w:r>
         <w:t xml:space="preserve"> </w:t>
@@ -105,10 +105,7 @@
         <w:t xml:space="preserve">COGMEN</w:t>
       </w:r>
       <w:r>
-        <w:t xml:space="preserve"> </w:t>
-      </w:r>
-      <w:r>
-        <w:t xml:space="preserve">ћемо затим тренирати над комбинованим скупом мултимодалних података за препознавање емоција, упоредити резултате са основном верзијом као и анализирати квалитет латентних репрезентација као и начин на који модел доноси одлуке.</w:t>
+        <w:t xml:space="preserve">. Помоћу ове архитектуре ћемо такође покушати да реконструишемо маскиране модале, као и будуће репрезентације на основу тренутних.</w:t>
       </w:r>
     </w:p>
     <w:p>
@@ -116,7 +113,7 @@
         <w:pStyle w:val="BodyText"/>
       </w:pPr>
       <w:r>
-        <w:t xml:space="preserve">Циљ овог рада је испитати да ли је могуће применити</w:t>
+        <w:t xml:space="preserve">Овако модификован модел</w:t>
       </w:r>
       <w:r>
         <w:t xml:space="preserve"> </w:t>
@@ -126,13 +123,21 @@
           <w:i/>
           <w:iCs/>
         </w:rPr>
-        <w:t xml:space="preserve">JEPA</w:t>
-      </w:r>
-      <w:r>
-        <w:t xml:space="preserve"> </w:t>
-      </w:r>
-      <w:r>
-        <w:t xml:space="preserve">архитектуру на мултимодалне податке, а затим и тренирати већ дефинисан модел за препознавање емоција користећи нове латентне репрезентације. Осим покушаја да се модел унапреди како би донео свеобухватно боље перформансе, циљ је такође анализирати да ли новим, бољим репрезентацијама модел може да лакше раздвоји сличне емоције, које је у оригиналном раду нешто лошије радио. Поред тога, један од задатака је анализирати како модел доноси закључке и зашто не успева да разликује сличне емоције. На крају ћемо покушати, на основу отпорности</w:t>
+        <w:t xml:space="preserve">COGMEN</w:t>
+      </w:r>
+      <w:r>
+        <w:t xml:space="preserve"> </w:t>
+      </w:r>
+      <w:r>
+        <w:t xml:space="preserve">ћемо затим тренирати над комбинованим скупом мултимодалних података за препознавање емоција, упоредити резултате са основном верзијом модела и анализирати квалитет латентних репрезентација, као и начин на који модел доноси одлуке.</w:t>
+      </w:r>
+    </w:p>
+    <w:p>
+      <w:pPr>
+        <w:pStyle w:val="BodyText"/>
+      </w:pPr>
+      <w:r>
+        <w:t xml:space="preserve">Циљ овог рада је да се испита да ли је могуће применити архитектуру</w:t>
       </w:r>
       <w:r>
         <w:t xml:space="preserve"> </w:t>
@@ -148,7 +153,23 @@
         <w:t xml:space="preserve"> </w:t>
       </w:r>
       <w:r>
-        <w:t xml:space="preserve">архитектуре на маскирање делова репрезентација, да реконструишемо маскиране репрезентације како у домену модала тако и у временском домену.</w:t>
+        <w:t xml:space="preserve">на мултимодалне податке, а затим и да се већ дефинисани модел за препознавање емоција тренира користећи нове латентне репрезентације. Осим покушаја да се модел унапреди тако да постигне боље укупне перформансе, циљ је и да се анализира да ли уз нове, квалитетније репрезентације модел може лакше да раздвоји сличне емоције, што му је у оригиналном раду представљало проблем. Поред тога, један од задатака је да се анализира како модел доноси закључке и зашто у појединим случајевима не успева да разликује сличне емоције. На крају ћемо, ослањајући се на отпорност архитектуре</w:t>
+      </w:r>
+      <w:r>
+        <w:t xml:space="preserve"> </w:t>
+      </w:r>
+      <w:r>
+        <w:rPr>
+          <w:i/>
+          <w:iCs/>
+        </w:rPr>
+        <w:t xml:space="preserve">JEPA</w:t>
+      </w:r>
+      <w:r>
+        <w:t xml:space="preserve"> </w:t>
+      </w:r>
+      <w:r>
+        <w:t xml:space="preserve">на маскирање делова репрезентација, покушати да реконструишемо маскиране репрезентације, како у домену модала, тако и у временском домену.</w:t>
       </w:r>
     </w:p>
     <w:bookmarkEnd w:id="9"/>

</xml_diff>